<commit_message>
Update migration and control report experience
</commit_message>
<xml_diff>
--- a/Renu_Prasad_Resume.docx
+++ b/Renu_Prasad_Resume.docx
@@ -40,7 +40,7 @@
     </w:p>
     <w:p>
       <w:r>
-        <w:t>Business Execution Consultant and Business Analyst with 7+ years of experience across home lending, financial technology, banking, and operations. Strong background in BRD/FRD creation, UAT coordination, stakeholder management, SQL analysis, reporting, process documentation, and Python-led automation. Designed document migration, EUCT documentation, desktop UI, version-control, dashboard, and Outlook automation solutions that reduced manual effort, improved auditability, and strengthened operational governance.</w:t>
+        <w:t>Business Execution Consultant and Business Analyst with 7+ years of experience across home lending, financial technology, banking, and operations. Strong background in BRD/FRD creation, UAT coordination, stakeholder management, SQL analysis, reporting, process documentation, and Python-led automation. Led large-scale document migration, control report documentation, dashboard, and workflow automation initiatives that improved audit readiness, accessibility, governance, and operational efficiency.</w:t>
       </w:r>
     </w:p>
     <w:p>
@@ -312,7 +312,7 @@
           <w:rFonts w:ascii="Calibri" w:hAnsi="Calibri"/>
           <w:sz w:val="20"/>
         </w:rPr>
-        <w:t>Automate repetitive data, document, and file-management activities using Python, Excel macros, and Power Automate across validation, metadata extraction, DMS migration, desktop UI workflows, reconciliation, text analysis, and repository processing.</w:t>
+        <w:t>Automate repetitive data, document, and file-management activities using Python, Excel macros, and Power Automate across validation, metadata extraction, migration support, desktop UI workflows, reconciliation, text analysis, and repository processing.</w:t>
       </w:r>
     </w:p>
     <w:p>
@@ -577,7 +577,21 @@
           <w:rFonts w:ascii="Calibri" w:hAnsi="Calibri"/>
           <w:sz w:val="20"/>
         </w:rPr>
-        <w:t>Enterprise Document Migration and Governance Automation: Built a Python framework to migrate thousands of business documents from legacy repositories into a DMS by identifying destination folders, creating missing structures, copying files, validating migration, handling retries, and generating audit logs; reduced manual migration effort by more than 90%.</w:t>
+        <w:t>Migration Project: Led a 2-member team to migrate and streamline 150,000+ documents from Jira to a centralized network drive repository within 3 months; managed document identification, cleanup, segregation, mapping, and repository organization to improve accessibility, governance, and process efficiency through a structured, semi-automated approach.</w:t>
+      </w:r>
+    </w:p>
+    <w:p>
+      <w:pPr>
+        <w:pStyle w:val="ListBullet"/>
+        <w:spacing w:after="40"/>
+        <w:ind w:left="317" w:hanging="173"/>
+      </w:pPr>
+      <w:r>
+        <w:rPr>
+          <w:rFonts w:ascii="Calibri" w:hAnsi="Calibri"/>
+          <w:sz w:val="20"/>
+        </w:rPr>
+        <w:t>Control Report Documentation: Prepared BRD, SDD, and UAT artifacts with business stakeholders for multiple undocumented control reports; performed QC, validation, and end-to-end documentation to support audit readiness, completeness, accuracy, compliance, and governance standards.</w:t>
       </w:r>
     </w:p>
     <w:p>

</xml_diff>

<commit_message>
Add PDF resume with active hyperlinks
</commit_message>
<xml_diff>
--- a/Renu_Prasad_Resume.docx
+++ b/Renu_Prasad_Resume.docx
@@ -23,8 +23,29 @@
         <w:jc w:val="center"/>
       </w:pPr>
       <w:r>
-        <w:t>Hyderabad, India | +91 9640595904 | renurichie@gmail.com | linkedin.com/in/renu-prasad-tupakula | renuprasad.work</w:t>
+        <w:t xml:space="preserve">Hyderabad, India | +91 9640595904 | renurichie@gmail.com | </w:t>
       </w:r>
+      <w:hyperlink r:id="rId9">
+        <w:r>
+          <w:rPr>
+            <w:color w:val="0563C1"/>
+            <w:u w:val="single"/>
+          </w:rPr>
+          <w:t>linkedin.com/in/renu-prasad-tupakula</w:t>
+        </w:r>
+      </w:hyperlink>
+      <w:r>
+        <w:t xml:space="preserve"> | </w:t>
+      </w:r>
+      <w:hyperlink r:id="rId10">
+        <w:r>
+          <w:rPr>
+            <w:color w:val="0563C1"/>
+            <w:u w:val="single"/>
+          </w:rPr>
+          <w:t>renuprasad.work</w:t>
+        </w:r>
+      </w:hyperlink>
     </w:p>
     <w:p>
       <w:pPr>

</xml_diff>

<commit_message>
Update resume skills wording and links
</commit_message>
<xml_diff>
--- a/Renu_Prasad_Resume.docx
+++ b/Renu_Prasad_Resume.docx
@@ -155,7 +155,7 @@
                 <w:b w:val="0"/>
                 <w:sz w:val="20"/>
               </w:rPr>
-              <w:t>SQL Server, Tableau, Power BI, SAS code review, DAX, KPI dashboards, data dictionaries</w:t>
+              <w:t>SQL Server, Tableau, Power BI, DAX, KPI dashboards, data dictionaries</w:t>
             </w:r>
           </w:p>
         </w:tc>
@@ -192,7 +192,7 @@
                 <w:b w:val="0"/>
                 <w:sz w:val="20"/>
               </w:rPr>
-              <w:t>Python, openpyxl, python-docx, PyAutoGUI, PyGetWindow, pywin32, multiprocessing, Excel macros</w:t>
+              <w:t>Python automation, document processing, desktop automation, file handling, validation workflows</w:t>
             </w:r>
           </w:p>
         </w:tc>
@@ -229,7 +229,7 @@
                 <w:b w:val="0"/>
                 <w:sz w:val="20"/>
               </w:rPr>
-              <w:t>IIS environments, workflow testing, SOPs, process mapping, client demos, training documentation</w:t>
+              <w:t>IIS environments, workflow testing, client demos, training documentation</w:t>
             </w:r>
           </w:p>
         </w:tc>
@@ -277,7 +277,7 @@
           <w:rFonts w:ascii="Calibri" w:hAnsi="Calibri"/>
           <w:sz w:val="20"/>
         </w:rPr>
-        <w:t>Create BRD, UAT, and technical specification documents by reverse engineering existing reports, dashboards, SQL queries, SAS code, Tableau workbooks, and Power BI assets.</w:t>
+        <w:t>Create BRD, UAT, and technical specification documents by reverse engineering existing reports, dashboards, SQL queries, Tableau workbooks, Power BI assets, and underlying report logic.</w:t>
       </w:r>
     </w:p>
     <w:p>
@@ -291,7 +291,7 @@
           <w:rFonts w:ascii="Calibri" w:hAnsi="Calibri"/>
           <w:sz w:val="20"/>
         </w:rPr>
-        <w:t>Refactor legacy reporting logic into process documentation, data dictionaries, mapping sheets, SOPs, and functional requirements for business and technology stakeholders.</w:t>
+        <w:t>Refactor legacy reporting logic into process documentation, data dictionaries, mapping sheets, process guides, and functional requirements for business and technology stakeholders.</w:t>
       </w:r>
     </w:p>
     <w:p>
@@ -333,7 +333,7 @@
           <w:rFonts w:ascii="Calibri" w:hAnsi="Calibri"/>
           <w:sz w:val="20"/>
         </w:rPr>
-        <w:t>Automate repetitive data, document, and file-management activities using Python, Excel macros, and Power Automate across validation, metadata extraction, migration support, desktop UI workflows, reconciliation, text analysis, and repository processing.</w:t>
+        <w:t>Automate repetitive data, document, and file-management activities using Python and Power Automate across validation, metadata extraction, migration support, desktop UI workflows, reconciliation, text analysis, and repository processing.</w:t>
       </w:r>
     </w:p>
     <w:p>
@@ -753,7 +753,7 @@
     </w:p>
     <w:p>
       <w:r>
-        <w:t>SQL Server, Python, Power BI, Tableau, DAX, SAS code analysis, Excel macros, Power Automate, Jira, Microsoft Dynamics, Dataverse, openpyxl, python-docx, PyAutoGUI, PyGetWindow, pywin32, pathlib, shutil, hashlib, multiprocessing, IIS, Microsoft Word, Excel, PowerPoint, HTML, CSS, XML</w:t>
+        <w:t>SQL Server, Python, Power BI, Tableau, DAX, Power Automate, Jira, Microsoft Dynamics, Dataverse, document processing, desktop automation, file handling, validation workflows, IIS, Microsoft Word, Excel, PowerPoint, HTML, CSS, XML</w:t>
       </w:r>
     </w:p>
     <w:sectPr>

</xml_diff>